<commit_message>
Update evaluation form and Excel template per user feedback
Word document changes:
- Moved 'Does Not Meet Expectations' checkbox to its own line
- Removed Comments sections from rating criteria (I-IV)
- Removed horizontal line before signature section
- Removed Notes fields from Additional Information sections
- Changed font to Times New Roman

Excel template changes:
- Added second date range column for each course
- Supports instructors who teach the same course twice per year
- Updated examples and instructions

https://claude.ai/code/session_019joi3KhwMT9HyLdFbSuVpw
</commit_message>
<xml_diff>
--- a/PTL_Evaluation_Form_Template.docx
+++ b/PTL_Evaluation_Form_Template.docx
@@ -8,6 +8,7 @@
       </w:pPr>
       <w:r>
         <w:rPr>
+          <w:rFonts w:ascii="Times New Roman" w:hAnsi="Times New Roman"/>
           <w:b/>
           <w:sz w:val="28"/>
         </w:rPr>
@@ -18,6 +19,7 @@
     <w:p>
       <w:r>
         <w:rPr>
+          <w:rFonts w:ascii="Times New Roman" w:hAnsi="Times New Roman"/>
           <w:b/>
         </w:rPr>
         <w:t xml:space="preserve">Faculty Name &amp; Department/Program: </w:t>
@@ -45,6 +47,7 @@
     <w:p>
       <w:r>
         <w:rPr>
+          <w:rFonts w:ascii="Times New Roman" w:hAnsi="Times New Roman"/>
           <w:b/>
         </w:rPr>
         <w:t xml:space="preserve">Evaluation Date: </w:t>
@@ -72,6 +75,7 @@
     <w:p>
       <w:r>
         <w:rPr>
+          <w:rFonts w:ascii="Times New Roman" w:hAnsi="Times New Roman"/>
           <w:b/>
         </w:rPr>
         <w:t xml:space="preserve">Course(s) Taught During Review Period: </w:t>
@@ -99,6 +103,7 @@
     <w:p>
       <w:r>
         <w:rPr>
+          <w:rFonts w:ascii="Times New Roman" w:hAnsi="Times New Roman"/>
           <w:b/>
         </w:rPr>
         <w:t xml:space="preserve">Faculty AACSB Status: </w:t>
@@ -127,6 +132,7 @@
     <w:p>
       <w:r>
         <w:rPr>
+          <w:rFonts w:ascii="Times New Roman" w:hAnsi="Times New Roman"/>
           <w:b/>
         </w:rPr>
         <w:t>I. Teaching Effectiveness</w:t>
@@ -205,6 +211,8 @@
       <w:r>
         <w:t xml:space="preserve"> Below Average    </w:t>
       </w:r>
+    </w:p>
+    <w:p>
       <w:r/>
       <w:sdt>
         <w:sdtPr>
@@ -224,37 +232,11 @@
         <w:t xml:space="preserve"> Does Not Meet Minimum COB Performance Expectations    </w:t>
       </w:r>
     </w:p>
-    <w:p>
-      <w:r>
-        <w:rPr>
-          <w:i/>
-        </w:rPr>
-        <w:t xml:space="preserve">Comments: </w:t>
-      </w:r>
-      <w:r/>
-      <w:sdt>
-        <w:sdtPr>
-          <w:tag w:val="Comments_I"/>
-          <w:alias w:val="Comments_I"/>
-          <w:placeholder>
-            <w:docPart w:val="[Enter comments for this section]"/>
-          </w:placeholder>
-          <w:showingPlcHdr/>
-        </w:sdtPr>
-        <w:sdtContent>
-          <w:r>
-            <w:rPr>
-              <w:color w:val="808080"/>
-            </w:rPr>
-            <w:t>[Enter comments for this section]</w:t>
-          </w:r>
-        </w:sdtContent>
-      </w:sdt>
-    </w:p>
     <w:p/>
     <w:p>
       <w:r>
         <w:rPr>
+          <w:rFonts w:ascii="Times New Roman" w:hAnsi="Times New Roman"/>
           <w:b/>
         </w:rPr>
         <w:t>II. Course Materials &amp; Professionalism</w:t>
@@ -333,6 +315,8 @@
       <w:r>
         <w:t xml:space="preserve"> Below Average    </w:t>
       </w:r>
+    </w:p>
+    <w:p>
       <w:r/>
       <w:sdt>
         <w:sdtPr>
@@ -352,37 +336,11 @@
         <w:t xml:space="preserve"> Does Not Meet Minimum COB Performance Expectations    </w:t>
       </w:r>
     </w:p>
-    <w:p>
-      <w:r>
-        <w:rPr>
-          <w:i/>
-        </w:rPr>
-        <w:t xml:space="preserve">Comments: </w:t>
-      </w:r>
-      <w:r/>
-      <w:sdt>
-        <w:sdtPr>
-          <w:tag w:val="Comments_II"/>
-          <w:alias w:val="Comments_II"/>
-          <w:placeholder>
-            <w:docPart w:val="[Enter comments for this section]"/>
-          </w:placeholder>
-          <w:showingPlcHdr/>
-        </w:sdtPr>
-        <w:sdtContent>
-          <w:r>
-            <w:rPr>
-              <w:color w:val="808080"/>
-            </w:rPr>
-            <w:t>[Enter comments for this section]</w:t>
-          </w:r>
-        </w:sdtContent>
-      </w:sdt>
-    </w:p>
     <w:p/>
     <w:p>
       <w:r>
         <w:rPr>
+          <w:rFonts w:ascii="Times New Roman" w:hAnsi="Times New Roman"/>
           <w:b/>
         </w:rPr>
         <w:t>III. Collegiality and Contribution to Department</w:t>
@@ -461,6 +419,8 @@
       <w:r>
         <w:t xml:space="preserve"> Below Average    </w:t>
       </w:r>
+    </w:p>
+    <w:p>
       <w:r/>
       <w:sdt>
         <w:sdtPr>
@@ -480,37 +440,11 @@
         <w:t xml:space="preserve"> Does Not Meet Minimum COB Performance Expectations    </w:t>
       </w:r>
     </w:p>
-    <w:p>
-      <w:r>
-        <w:rPr>
-          <w:i/>
-        </w:rPr>
-        <w:t xml:space="preserve">Comments: </w:t>
-      </w:r>
-      <w:r/>
-      <w:sdt>
-        <w:sdtPr>
-          <w:tag w:val="Comments_III"/>
-          <w:alias w:val="Comments_III"/>
-          <w:placeholder>
-            <w:docPart w:val="[Enter comments for this section]"/>
-          </w:placeholder>
-          <w:showingPlcHdr/>
-        </w:sdtPr>
-        <w:sdtContent>
-          <w:r>
-            <w:rPr>
-              <w:color w:val="808080"/>
-            </w:rPr>
-            <w:t>[Enter comments for this section]</w:t>
-          </w:r>
-        </w:sdtContent>
-      </w:sdt>
-    </w:p>
     <w:p/>
     <w:p>
       <w:r>
         <w:rPr>
+          <w:rFonts w:ascii="Times New Roman" w:hAnsi="Times New Roman"/>
           <w:b/>
         </w:rPr>
         <w:t>IV. Overall Performance Rating</w:t>
@@ -589,6 +523,8 @@
       <w:r>
         <w:t xml:space="preserve"> Below Average    </w:t>
       </w:r>
+    </w:p>
+    <w:p>
       <w:r/>
       <w:sdt>
         <w:sdtPr>
@@ -608,37 +544,11 @@
         <w:t xml:space="preserve"> Does Not Meet Minimum COB Performance Expectations    </w:t>
       </w:r>
     </w:p>
-    <w:p>
-      <w:r>
-        <w:rPr>
-          <w:i/>
-        </w:rPr>
-        <w:t xml:space="preserve">Comments: </w:t>
-      </w:r>
-      <w:r/>
-      <w:sdt>
-        <w:sdtPr>
-          <w:tag w:val="Comments_IV"/>
-          <w:alias w:val="Comments_IV"/>
-          <w:placeholder>
-            <w:docPart w:val="[Enter comments for this section]"/>
-          </w:placeholder>
-          <w:showingPlcHdr/>
-        </w:sdtPr>
-        <w:sdtContent>
-          <w:r>
-            <w:rPr>
-              <w:color w:val="808080"/>
-            </w:rPr>
-            <w:t>[Enter comments for this section]</w:t>
-          </w:r>
-        </w:sdtContent>
-      </w:sdt>
-    </w:p>
     <w:p/>
     <w:p>
       <w:r>
         <w:rPr>
+          <w:rFonts w:ascii="Times New Roman" w:hAnsi="Times New Roman"/>
           <w:b/>
         </w:rPr>
         <w:t>Chair/Director's Summary Comments:</w:t>
@@ -669,6 +579,7 @@
     <w:p>
       <w:r>
         <w:rPr>
+          <w:rFonts w:ascii="Times New Roman" w:hAnsi="Times New Roman"/>
           <w:b/>
         </w:rPr>
         <w:t>Chair/Director's Recommendation:</w:t>
@@ -716,6 +627,7 @@
     <w:p>
       <w:r>
         <w:rPr>
+          <w:rFonts w:ascii="Times New Roman" w:hAnsi="Times New Roman"/>
           <w:b/>
         </w:rPr>
         <w:t xml:space="preserve">Chair/Director's Signature: </w:t>
@@ -765,16 +677,12 @@
     <w:p/>
     <w:p/>
     <w:p>
-      <w:r>
-        <w:t>________________________________________________________________________________</w:t>
-      </w:r>
-    </w:p>
-    <w:p>
       <w:pPr>
         <w:jc w:val="center"/>
       </w:pPr>
       <w:r>
         <w:rPr>
+          <w:rFonts w:ascii="Times New Roman" w:hAnsi="Times New Roman"/>
           <w:b/>
         </w:rPr>
         <w:t>Additional Information:</w:t>
@@ -784,6 +692,7 @@
     <w:p>
       <w:r>
         <w:rPr>
+          <w:rFonts w:ascii="Times New Roman" w:hAnsi="Times New Roman"/>
           <w:b/>
         </w:rPr>
         <w:t>I. Teaching Effectiveness</w:t>
@@ -794,43 +703,17 @@
         <w:ind w:left="360"/>
       </w:pPr>
       <w:r>
+        <w:rPr>
+          <w:rFonts w:ascii="Times New Roman" w:hAnsi="Times New Roman"/>
+        </w:rPr>
         <w:t>Evaluate the instructor's performance in teaching based on student feedback, peer observation (if applicable), adherence to syllabi and learning objectives, grading fairness, and classroom engagement.</w:t>
       </w:r>
-    </w:p>
-    <w:p>
-      <w:pPr>
-        <w:ind w:left="360"/>
-      </w:pPr>
-      <w:r>
-        <w:rPr>
-          <w:i/>
-        </w:rPr>
-        <w:t xml:space="preserve">Notes: </w:t>
-      </w:r>
-      <w:r/>
-      <w:sdt>
-        <w:sdtPr>
-          <w:tag w:val="Notes_Teaching"/>
-          <w:alias w:val="Notes_Teaching"/>
-          <w:placeholder>
-            <w:docPart w:val="[Enter additional notes for Teaching Effectiveness]"/>
-          </w:placeholder>
-          <w:showingPlcHdr/>
-        </w:sdtPr>
-        <w:sdtContent>
-          <w:r>
-            <w:rPr>
-              <w:color w:val="808080"/>
-            </w:rPr>
-            <w:t>[Enter additional notes for Teaching Effectiveness]</w:t>
-          </w:r>
-        </w:sdtContent>
-      </w:sdt>
     </w:p>
     <w:p/>
     <w:p>
       <w:r>
         <w:rPr>
+          <w:rFonts w:ascii="Times New Roman" w:hAnsi="Times New Roman"/>
           <w:b/>
         </w:rPr>
         <w:t>II. Course Materials and Professionalism</w:t>
@@ -841,43 +724,17 @@
         <w:ind w:left="360"/>
       </w:pPr>
       <w:r>
+        <w:rPr>
+          <w:rFonts w:ascii="Times New Roman" w:hAnsi="Times New Roman"/>
+        </w:rPr>
         <w:t>Evaluate punctuality, timely grade submission, communication with students, syllabus completion, and adherence to university/college policies.</w:t>
       </w:r>
-    </w:p>
-    <w:p>
-      <w:pPr>
-        <w:ind w:left="360"/>
-      </w:pPr>
-      <w:r>
-        <w:rPr>
-          <w:i/>
-        </w:rPr>
-        <w:t xml:space="preserve">Notes: </w:t>
-      </w:r>
-      <w:r/>
-      <w:sdt>
-        <w:sdtPr>
-          <w:tag w:val="Notes_Materials"/>
-          <w:alias w:val="Notes_Materials"/>
-          <w:placeholder>
-            <w:docPart w:val="[Enter additional notes for Course Materials &amp; Professionalism]"/>
-          </w:placeholder>
-          <w:showingPlcHdr/>
-        </w:sdtPr>
-        <w:sdtContent>
-          <w:r>
-            <w:rPr>
-              <w:color w:val="808080"/>
-            </w:rPr>
-            <w:t>[Enter additional notes for Course Materials &amp; Professionalism]</w:t>
-          </w:r>
-        </w:sdtContent>
-      </w:sdt>
     </w:p>
     <w:p/>
     <w:p>
       <w:r>
         <w:rPr>
+          <w:rFonts w:ascii="Times New Roman" w:hAnsi="Times New Roman"/>
           <w:b/>
         </w:rPr>
         <w:t>III. Collegiality and Contribution to Department</w:t>
@@ -888,38 +745,11 @@
         <w:ind w:left="360"/>
       </w:pPr>
       <w:r>
+        <w:rPr>
+          <w:rFonts w:ascii="Times New Roman" w:hAnsi="Times New Roman"/>
+        </w:rPr>
         <w:t>Evaluate cooperation, reliability, and contribution to departmental goals (e.g., attending meetings when invited, supporting curriculum consistency).</w:t>
       </w:r>
-    </w:p>
-    <w:p>
-      <w:pPr>
-        <w:ind w:left="360"/>
-      </w:pPr>
-      <w:r>
-        <w:rPr>
-          <w:i/>
-        </w:rPr>
-        <w:t xml:space="preserve">Notes: </w:t>
-      </w:r>
-      <w:r/>
-      <w:sdt>
-        <w:sdtPr>
-          <w:tag w:val="Notes_Collegiality"/>
-          <w:alias w:val="Notes_Collegiality"/>
-          <w:placeholder>
-            <w:docPart w:val="[Enter additional notes for Collegiality]"/>
-          </w:placeholder>
-          <w:showingPlcHdr/>
-        </w:sdtPr>
-        <w:sdtContent>
-          <w:r>
-            <w:rPr>
-              <w:color w:val="808080"/>
-            </w:rPr>
-            <w:t>[Enter additional notes for Collegiality]</w:t>
-          </w:r>
-        </w:sdtContent>
-      </w:sdt>
     </w:p>
     <w:sectPr>
       <w:pgSz w:w="12240" w:h="15840"/>
@@ -1295,7 +1125,7 @@
     <w:qFormat/>
     <w:rsid w:val="00FC693F"/>
     <w:rPr>
-      <w:rFonts w:ascii="Calibri" w:hAnsi="Calibri"/>
+      <w:rFonts w:ascii="Times New Roman" w:hAnsi="Times New Roman"/>
       <w:sz w:val="22"/>
     </w:rPr>
   </w:style>

</xml_diff>